<commit_message>
vault backup: 2026-07-12 22:25:00
</commit_message>
<xml_diff>
--- a/2026-7/入党材料/思想汇报.docx
+++ b/2026-7/入党材料/思想汇报.docx
@@ -5,6 +5,9 @@
     <w:p>
       <w:pPr>
         <w:jc w:val="center"/>
+        <w:rPr>
+          <w:rFonts w:hint="eastAsia"/>
+        </w:rPr>
       </w:pPr>
       <w:r>
         <w:rPr>
@@ -14,55 +17,61 @@
       </w:r>
     </w:p>
     <w:p>
+      <w:pPr>
+        <w:rPr>
+          <w:rFonts w:hint="eastAsia"/>
+        </w:rPr>
+      </w:pPr>
       <w:r>
         <w:t>敬爱的党组织：</w:t>
       </w:r>
     </w:p>
     <w:p>
-      <w:r>
-        <w:t>初春启新，聚力前行。2025年第一季度，我始终坚持理论学习与实践</w:t>
-      </w:r>
-      <w:proofErr w:type="gramStart"/>
-      <w:r>
-        <w:t>践行</w:t>
-      </w:r>
-      <w:proofErr w:type="gramEnd"/>
-      <w:r>
-        <w:t>相结合，紧跟国家时政热点，重点学习2025年全国两会精神，在领会国家发展部署、感悟时代使命中锤炼党性、提升觉悟，思想认知和责任担当得到显著提升。今年3月，十四届全国人大三次会议、全国政协十四届三次会议顺利召开，为全年经济社会发展、民生建设、科技创新等各项工作划定目标、明确路径，是全年发展的总纲领、总指南。</w:t>
-      </w:r>
-    </w:p>
-    <w:p>
+      <w:pPr>
+        <w:rPr>
+          <w:rFonts w:hint="eastAsia"/>
+        </w:rPr>
+      </w:pPr>
+      <w:r>
+        <w:t>初春启新，聚力前行。2025年第一季度，我始终坚持理论学习与实践践行相结合，紧跟国家时政热点，重点学习2025年全国两会精神，在领会国家发展部署、感悟时代使命中锤炼党性、提升觉悟，思想认知和责任担当得到显著提升。今年3月，十四届全国人大三次会议、全国政协十四届三次会议顺利召开，为全年经济社会发展、民生建设、科技创新等各项工作划定目标、明确路径，是全年发展的总纲领、总指南。</w:t>
+      </w:r>
+    </w:p>
+    <w:p>
+      <w:pPr>
+        <w:rPr>
+          <w:rFonts w:hint="eastAsia"/>
+        </w:rPr>
+      </w:pPr>
       <w:r>
         <w:t>通过系统学习两会政府工作报告和总书记两会期间重要讲话精神，我全面了解了2024年我国发展取得的扎实成效，也清晰掌握了2025年国家发展重点任务。报告明确全年经济社会发展核心目标，聚焦高质量发展，着力培育新质生产力，持续推进产业升级、科技创新、乡村振兴、民生保障等重点工作。</w:t>
       </w:r>
     </w:p>
     <w:p>
+      <w:pPr>
+        <w:rPr>
+          <w:rFonts w:hint="eastAsia"/>
+        </w:rPr>
+      </w:pPr>
       <w:r>
         <w:t>结合自身实际，我深刻反思了现阶段存在的问题。一是对两会精神的学习不够深入透彻，对新质生产力、高质量发展等核心概念的理解流于表面，缺乏深层次思考；二是理论联系实际不够紧密，难以将时政精神有效融入日常学习工作；三是创新意识不足，面对新任务新要求，习惯于固有思维，主动突破、主动创新的积极性欠缺。</w:t>
       </w:r>
     </w:p>
     <w:p>
-      <w:r>
-        <w:t>针对以上不足，我将针对性整改提升。一是深耕两会精神学习，结合党的创新理论系统研读，吃透核心要义、把握时代内涵，树立大局发展思维；二是坚持学用结合，立足自身岗位对标两会发展要求，锤炼实干本领、提升综合能力；三是主动担当作为，积极</w:t>
-      </w:r>
-      <w:proofErr w:type="gramStart"/>
-      <w:r>
-        <w:t>践行</w:t>
-      </w:r>
-      <w:proofErr w:type="gramEnd"/>
-      <w:r>
-        <w:t>新时代青年使命，勇于突破自我、务实进取，在平凡岗位上坚守初心、</w:t>
-      </w:r>
-      <w:proofErr w:type="gramStart"/>
-      <w:r>
-        <w:t>践行</w:t>
-      </w:r>
-      <w:proofErr w:type="gramEnd"/>
-      <w:r>
-        <w:t>使命。</w:t>
-      </w:r>
-    </w:p>
-    <w:p>
+      <w:pPr>
+        <w:rPr>
+          <w:rFonts w:hint="eastAsia"/>
+        </w:rPr>
+      </w:pPr>
+      <w:r>
+        <w:t>针对以上不足，我将针对性整改提升。一是深耕两会精神学习，结合党的创新理论系统研读，吃透核心要义、把握时代内涵，树立大局发展思维；二是坚持学用结合，立足自身岗位对标两会发展要求，锤炼实干本领、提升综合能力；三是主动担当作为，积极践行新时代青年使命，勇于突破自我、务实进取，在平凡岗位上坚守初心、践行使命。</w:t>
+      </w:r>
+    </w:p>
+    <w:p>
+      <w:pPr>
+        <w:rPr>
+          <w:rFonts w:hint="eastAsia"/>
+        </w:rPr>
+      </w:pPr>
       <w:r>
         <w:t>请党组织继续对我监督、教育和考验。</w:t>
       </w:r>
@@ -89,34 +98,33 @@
       </w:r>
     </w:p>
     <w:p>
+      <w:pPr>
+        <w:rPr>
+          <w:rFonts w:hint="eastAsia"/>
+        </w:rPr>
+      </w:pPr>
       <w:r>
         <w:t>敬爱的党组织：</w:t>
       </w:r>
     </w:p>
     <w:p>
-      <w:r>
-        <w:t>时序初夏，笃行不</w:t>
-      </w:r>
-      <w:proofErr w:type="gramStart"/>
-      <w:r>
-        <w:t>怠</w:t>
-      </w:r>
-      <w:proofErr w:type="gramEnd"/>
-      <w:r>
-        <w:t>。2025年第二季度，我持续加强党的创新理论学习，密切关注国家科技发展、民生建设、基层治理等时政热点，在常态化学习与实践中淬炼党性、坚定信仰，不断提升自身思想觉悟和综合素养。本季度，我国持续推进高水平科技自立自强，各地深入落实两会部署，扎实推进民生工程、乡村振兴、生态保护等重点工作，国家发展稳步向好，让我深受触动、倍感振奋。</w:t>
-      </w:r>
-    </w:p>
-    <w:p>
-      <w:r>
-        <w:t>通过持续学习，我深刻认识到，科技兴则国家兴，创新强则民族强。新时代的高质量发展，核心在于创新驱动，而一代</w:t>
-      </w:r>
-      <w:proofErr w:type="gramStart"/>
-      <w:r>
-        <w:t>代</w:t>
-      </w:r>
-      <w:proofErr w:type="gramEnd"/>
-      <w:r>
-        <w:t>科研工作者的坚守拼搏、无私奉献，正是国家科技腾飞的底气所在。同时我明白，国家的发展进步从来不是单方面的突破，而是统筹发展、全面进步的结果，经济发展、民生改善、生态保护、科技创新相辅相成，彰显</w:t>
+      <w:pPr>
+        <w:rPr>
+          <w:rFonts w:hint="eastAsia"/>
+        </w:rPr>
+      </w:pPr>
+      <w:r>
+        <w:t>时序初夏，笃行不怠。2025年第二季度，我持续加强党的创新理论学习，密切关注国家科技发展、民生建设、基层治理等时政热点，在常态化学习与实践中淬炼党性、坚定信仰，不断提升自身思想觉悟和综合素养。本季度，我国持续推进高水平科技自立自强，各地深入落实两会部署，扎实推进民生工程、乡村振兴、生态保护等重点工作，国家发展稳步向好，让我深受触动、倍感振奋。</w:t>
+      </w:r>
+    </w:p>
+    <w:p>
+      <w:pPr>
+        <w:rPr>
+          <w:rFonts w:hint="eastAsia"/>
+        </w:rPr>
+      </w:pPr>
+      <w:r>
+        <w:t>通过持续学习，我深刻认识到，科技兴则国家兴，创新强则民族强。新时代的高质量发展，核心在于创新驱动，而一代代科研工作者的坚守拼搏、无私奉献，正是国家科技腾飞的底气所在。同时我明白，国家的发展进步从来不是单方面的突破，而是统筹发展、全面进步的结果，经济发展、民生改善、生态保护、科技创新相辅相成，彰显</w:t>
       </w:r>
       <w:r>
         <w:lastRenderedPageBreak/>
@@ -124,19 +132,21 @@
       </w:r>
     </w:p>
     <w:p>
-      <w:r>
-        <w:t>反观自身，我仍存在诸多不足：一是理论学习缺乏系统性，对科技创新、高质量发展等时代课题的认知不够深刻；二是进取意识有待加强，日常学习工作中</w:t>
-      </w:r>
-      <w:proofErr w:type="gramStart"/>
-      <w:r>
-        <w:t>缺乏攻坚</w:t>
-      </w:r>
-      <w:proofErr w:type="gramEnd"/>
-      <w:r>
-        <w:t>克难的韧劲；三是服务群众的主动性不足，参与社会实践、服务基层的力度不够。</w:t>
-      </w:r>
-    </w:p>
-    <w:p>
+      <w:pPr>
+        <w:rPr>
+          <w:rFonts w:hint="eastAsia"/>
+        </w:rPr>
+      </w:pPr>
+      <w:r>
+        <w:t>反观自身，我仍存在诸多不足：一是理论学习缺乏系统性，对科技创新、高质量发展等时代课题的认知不够深刻；二是进取意识有待加强，日常学习工作中缺乏攻坚克难的韧劲；三是服务群众的主动性不足，参与社会实践、服务基层的力度不够。</w:t>
+      </w:r>
+    </w:p>
+    <w:p>
+      <w:pPr>
+        <w:rPr>
+          <w:rFonts w:hint="eastAsia"/>
+        </w:rPr>
+      </w:pPr>
       <w:r>
         <w:t>今后，我将立足问题、补齐短板，持续精进自我。强化系统理论学习，主动研读党的最新理论成果和国家发展政策，紧跟时代步伐，树立正确的世界观、人生观、价值观</w:t>
       </w:r>
@@ -146,13 +156,8 @@
         </w:rPr>
         <w:t>。</w:t>
       </w:r>
-      <w:proofErr w:type="gramStart"/>
-      <w:r>
-        <w:t>锤炼进取</w:t>
-      </w:r>
-      <w:proofErr w:type="gramEnd"/>
-      <w:r>
-        <w:t>拼搏的奋斗精神，立足本职勤学苦练、踏实干事，不断提升专业能力和实干本领</w:t>
+      <w:r>
+        <w:t>锤炼进取拼搏的奋斗精神，立足本职勤学苦练、踏实干事，不断提升专业能力和实干本领</w:t>
       </w:r>
       <w:r>
         <w:rPr>
@@ -162,6 +167,11 @@
       </w:r>
     </w:p>
     <w:p>
+      <w:pPr>
+        <w:rPr>
+          <w:rFonts w:hint="eastAsia"/>
+        </w:rPr>
+      </w:pPr>
       <w:r>
         <w:t>请党组织继续对我监督、教育和考验。</w:t>
       </w:r>
@@ -188,49 +198,88 @@
       </w:r>
     </w:p>
     <w:p>
+      <w:pPr>
+        <w:rPr>
+          <w:rFonts w:hint="eastAsia"/>
+        </w:rPr>
+      </w:pPr>
       <w:r>
         <w:t>敬爱的党组织：</w:t>
       </w:r>
     </w:p>
     <w:p>
+      <w:pPr>
+        <w:rPr>
+          <w:rFonts w:hint="eastAsia"/>
+        </w:rPr>
+      </w:pPr>
       <w:r>
         <w:t>金秋九月，蓄力奋进。2025年第三季度，我始终以入党积极分子的标准严格约束自身言行，坚持常态化理论学习，密切关注时政动态，在学习实践中锤炼党性、坚守初心，思想认知、责任担当和实干能力均得到稳步提升。本季度，全国上下持续深化学习党的创新理论，扎实推进全年各项发展任务，全力冲刺年度发展目标，同时全社会弘扬尊师重教、崇德向善的优良风尚，让我对党员的责任与担当有了更为真切的认知。</w:t>
       </w:r>
     </w:p>
     <w:p>
+      <w:pPr>
+        <w:rPr>
+          <w:rFonts w:hint="eastAsia"/>
+        </w:rPr>
+      </w:pPr>
       <w:r>
         <w:t>本季度我重点学习了党中央关于实干担当、作风建设的相关重要精神。当前，国家发展进入提质增效的关键阶段，面对复杂的内外环境，党中央始终坚持稳中求进工作总基调，号召全国上下弘扬求真务实、真抓实干的工作作风，以钉钉子精神落实各项发展部署。</w:t>
       </w:r>
-    </w:p>
-    <w:p>
-      <w:r>
-        <w:t>对照党员标准，我清醒认识到自身短板：一是作风建设有待加强，偶尔存在敷衍懈怠、浮躁松懈的心态，干事韧劲不足；二是理论</w:t>
-      </w:r>
-      <w:proofErr w:type="gramStart"/>
-      <w:r>
-        <w:t>践行</w:t>
-      </w:r>
-      <w:proofErr w:type="gramEnd"/>
-      <w:r>
-        <w:t>不够到位，学用脱节，未能充分将理论学习成果转化为实干动力；三是自我要求不够严格，细节把控不足，先锋模范作用发挥不充分。</w:t>
-      </w:r>
-    </w:p>
-    <w:p>
+      <w:r>
+        <w:rPr>
+          <w:rFonts w:hint="eastAsia"/>
+        </w:rPr>
+        <w:t xml:space="preserve"> </w:t>
+      </w:r>
+    </w:p>
+    <w:p>
+      <w:pPr>
+        <w:rPr>
+          <w:rFonts w:hint="eastAsia"/>
+        </w:rPr>
+      </w:pPr>
+      <w:r>
+        <w:t>对照党员标准，我清醒认识到自身短板：一是作风建设有待加强，偶尔存在敷衍懈怠、浮躁松懈的心态，干事韧劲不足；二是理论践行不够到位，学用脱节，未能充分将理论学习成果转化为实干动力；三是自我要求不够严格，细节把控不足，先锋模范作用发挥不充分。</w:t>
+      </w:r>
+    </w:p>
+    <w:p>
+      <w:pPr>
+        <w:rPr>
+          <w:rFonts w:hint="eastAsia"/>
+        </w:rPr>
+      </w:pPr>
       <w:r>
         <w:t>针对以上问题，我将认真整改、从严律己。一是筑牢思想作风根基，摒弃浮躁心态，养成求真务实、持之以恒的优良作风，踏实做好每一项工作；二是深化学用结合，坚持以理论指导实践，立足本职岗位勤学苦练、担当作为；三是严格自我要求，从小事细节做起，主动服务他人、奉献集体，积极发挥带头作用。我将始终坚守入党初心，砥砺前行、久久为功，持续提升自身党性修养，争取早日成为一名合格的共产党员。</w:t>
       </w:r>
     </w:p>
     <w:p>
+      <w:pPr>
+        <w:rPr>
+          <w:rFonts w:hint="eastAsia"/>
+        </w:rPr>
+      </w:pPr>
       <w:r>
         <w:t>请党组织继续对我监督、教育和考验。</w:t>
       </w:r>
     </w:p>
     <w:p>
+      <w:pPr>
+        <w:rPr>
+          <w:rFonts w:hint="eastAsia"/>
+        </w:rPr>
+      </w:pPr>
       <w:r>
         <w:t>汇报人：XXX</w:t>
       </w:r>
     </w:p>
-    <w:p/>
+    <w:p>
+      <w:pPr>
+        <w:rPr>
+          <w:rFonts w:hint="eastAsia"/>
+        </w:rPr>
+      </w:pPr>
+    </w:p>
     <w:p>
       <w:pPr>
         <w:jc w:val="center"/>
@@ -246,16 +295,31 @@
       </w:r>
     </w:p>
     <w:p>
+      <w:pPr>
+        <w:rPr>
+          <w:rFonts w:hint="eastAsia"/>
+        </w:rPr>
+      </w:pPr>
       <w:r>
         <w:t>敬爱的党组织：</w:t>
       </w:r>
     </w:p>
     <w:p>
-      <w:r>
-        <w:t>岁末收官，复盘笃行。2025年第四季度，我持续深化党的创新理论学习，全面复盘年度思想成长与实践收获，紧跟年末国家发展总结、作风建设、民生提质等时政热点，在回望总结中坚定信念、明晰不足、聚力前行，党性修养和思想觉悟得到进一步锤炼。临近年末，全国上下全面复盘2025年发展成果，统筹谋划来年工作，各行各业坚守岗位、收官冲刺，全社会实干奋进的氛围浓厚，让我深受教育和启发。</w:t>
-      </w:r>
-    </w:p>
-    <w:p>
+      <w:pPr>
+        <w:rPr>
+          <w:rFonts w:hint="eastAsia"/>
+        </w:rPr>
+      </w:pPr>
+      <w:r>
+        <w:t>岁末收官，复盘笃行。2025年第四季度，我持续深化党的创新理论学习，全面复盘年度思想成长与实践收获，紧跟年末国家发展总结、作风建设、民生提质等时政热点，在回望总结中坚定信念、明晰不足、聚力前行，党性修养和思想觉悟得到进一步锤炼。</w:t>
+      </w:r>
+    </w:p>
+    <w:p>
+      <w:pPr>
+        <w:rPr>
+          <w:rFonts w:hint="eastAsia"/>
+        </w:rPr>
+      </w:pPr>
       <w:r>
         <w:t>本季度，我重点学习了年度国家发展总结相关精神，深刻回望2025年国家发展的奋进征程。这一年，我国顶住外部压力、克服内部困难，持续推进高质量发展，新质生产力加速落地，各项事业发展取得阶段性成效。这些来之不易的成就，根本在于党中央的坚强领导和科学决策，彰显了中国特色社会主义制度的显著优势</w:t>
       </w:r>
@@ -267,26 +331,205 @@
       </w:r>
     </w:p>
     <w:p>
+      <w:pPr>
+        <w:rPr>
+          <w:rFonts w:hint="eastAsia"/>
+        </w:rPr>
+      </w:pPr>
       <w:r>
         <w:t>结合全年成长，我深刻反思自身存在的突出问题：一是年度理论学习缺乏系统性规划，学习碎片化、浅层化，深度钻研不足；二是实干担当的主动性不足，面对难点任务存在畏难情绪，拼搏劲头不够；三是服务奉献的格局有待提升，服务他人、奉献集体的自觉性、持续性不足。</w:t>
       </w:r>
     </w:p>
     <w:p>
+      <w:pPr>
+        <w:rPr>
+          <w:rFonts w:hint="eastAsia"/>
+        </w:rPr>
+      </w:pPr>
       <w:r>
         <w:t>新的一年，我将以年度复盘为契机，补齐短板、精进自我。制定系统的理论学习计划，常态化研读党的创新理论和时政政策，筑牢思想根基；强化担当精神，敢于直面困难、攻坚克难，锤炼求真务实的实干作风；我将始终紧跟党的步伐，坚定理想信念、砥砺过硬品格，以更严格的标准要求自己，争取早日加入中国共产党。</w:t>
       </w:r>
     </w:p>
     <w:p>
+      <w:pPr>
+        <w:rPr>
+          <w:rFonts w:hint="eastAsia"/>
+        </w:rPr>
+      </w:pPr>
       <w:r>
         <w:t>请党组织继续对我监督、教育和考验。</w:t>
       </w:r>
     </w:p>
     <w:p>
+      <w:pPr>
+        <w:rPr>
+          <w:rFonts w:hint="eastAsia"/>
+        </w:rPr>
+      </w:pPr>
       <w:r>
         <w:t>汇报人：XXX</w:t>
       </w:r>
     </w:p>
-    <w:p/>
+    <w:p>
+      <w:pPr>
+        <w:jc w:val="center"/>
+        <w:rPr>
+          <w:b/>
+          <w:bCs/>
+        </w:rPr>
+      </w:pPr>
+      <w:r>
+        <w:rPr>
+          <w:b/>
+          <w:bCs/>
+        </w:rPr>
+        <w:t>思想汇报</w:t>
+      </w:r>
+    </w:p>
+    <w:p>
+      <w:r>
+        <w:t>敬爱的党组织：</w:t>
+      </w:r>
+    </w:p>
+    <w:p>
+      <w:pPr>
+        <w:rPr>
+          <w:rFonts w:hint="eastAsia"/>
+        </w:rPr>
+      </w:pPr>
+      <w:r>
+        <w:t>春启新程，奋楫争先。2026年第一季度，我始终坚守入党初心，持续强化理论武装，密切关注全国两会及“十五五”规划开局部署等核心时政热点，思想觉悟和大局意识持续提升。本季度，十四届全国人大四次会议胜利召开，重点部署“十五五”开局之年各项工作，为国家中长期发展擘画宏伟蓝图，意义深远、催人奋进。</w:t>
+      </w:r>
+      <w:r>
+        <w:rPr>
+          <w:rFonts w:hint="eastAsia"/>
+        </w:rPr>
+        <w:t xml:space="preserve">    </w:t>
+      </w:r>
+    </w:p>
+    <w:p>
+      <w:r>
+        <w:t>“十五五”规划的开局起步，让我深刻认识到，国家发展是循序渐进、久久为功的系统工程，一代代共产党人接续奋斗、实干笃行，才铸就了如今的发展成就。作为一名</w:t>
+      </w:r>
+      <w:r>
+        <w:rPr>
+          <w:rFonts w:hint="eastAsia"/>
+        </w:rPr>
+        <w:t>预备党员</w:t>
+      </w:r>
+      <w:r>
+        <w:t>，我深刻意识到，必须主动对标国家发展需求，把个人理想融入国家发展和民族复兴的伟大事业中。</w:t>
+      </w:r>
+    </w:p>
+    <w:p>
+      <w:r>
+        <w:t>对照新时代党员标准，我认真开展自我检视，发现自身仍存在明显不足：一是对“十五</w:t>
+      </w:r>
+      <w:r>
+        <w:lastRenderedPageBreak/>
+        <w:t>五”规划、高质量发展等新政策、新部署的学习不够深入，大局思维和战略视野不足；二是学用结合不够紧密，未能将时政精神有效转化为自身成长动力</w:t>
+      </w:r>
+      <w:r>
+        <w:rPr>
+          <w:rFonts w:hint="eastAsia"/>
+        </w:rPr>
+        <w:t>。</w:t>
+      </w:r>
+    </w:p>
+    <w:p>
+      <w:r>
+        <w:t>今后，我将立足新起点、展现新作为，全面提升自我。深耕时政理论学习，系统研读两会精神和“十五五”规划纲要，树立大局观念、把握时代大势</w:t>
+      </w:r>
+      <w:r>
+        <w:rPr>
+          <w:rFonts w:hint="eastAsia"/>
+        </w:rPr>
+        <w:t>。</w:t>
+      </w:r>
+      <w:r>
+        <w:t>强化责任担当，主动践行青年使命，积极服务集体、帮助他人，在实践中锤炼党性、践行初心。我将始终听党话、跟党走，以持之以恒的努力向党组织靠拢。</w:t>
+      </w:r>
+    </w:p>
+    <w:p>
+      <w:r>
+        <w:t>请党组织继续对我监督、教育和考验。</w:t>
+      </w:r>
+    </w:p>
+    <w:p>
+      <w:r>
+        <w:t>汇报人：XXX</w:t>
+      </w:r>
+    </w:p>
+    <w:p>
+      <w:pPr>
+        <w:rPr>
+          <w:b/>
+          <w:bCs/>
+        </w:rPr>
+      </w:pPr>
+      <w:r>
+        <w:rPr>
+          <w:b/>
+          <w:bCs/>
+        </w:rPr>
+        <w:t>思想汇报</w:t>
+      </w:r>
+    </w:p>
+    <w:p>
+      <w:r>
+        <w:t>敬爱的党组织：</w:t>
+      </w:r>
+    </w:p>
+    <w:p>
+      <w:r>
+        <w:t>盛夏笃行，不负韶华。2026年第二季度，我持续加强党的创新理论系统性学习，紧跟“十五五”开局之年国家各项建设推进态势，聚焦民生提质、科技创新、基层治理等时政热点，在学习实践中不断淬炼党性、锤炼作风、提升能力，以严谨务实的态度持续向党组织靠拢。</w:t>
+      </w:r>
+    </w:p>
+    <w:p>
+      <w:r>
+        <w:t>通过持续学习和观察，我深刻感悟到，中国式现代化的推进，离不开党的科学引领，更离不开无数奋斗者的默默坚守。从科研一线的技术攻关到基层一线的民生服务，无数党员冲锋在前、率先垂范，用实干担当扛起时代责任，为我树立了鲜活的榜样。</w:t>
+      </w:r>
+    </w:p>
+    <w:p>
+      <w:r>
+        <w:t>结合日常表现，我深刻</w:t>
+      </w:r>
+      <w:r>
+        <w:rPr>
+          <w:rFonts w:hint="eastAsia"/>
+        </w:rPr>
+        <w:t>反省</w:t>
+      </w:r>
+      <w:r>
+        <w:t>自身不足：一是理论学习的深度和广度不足，对新时代新思想、新政策的理解不够透彻，系统性、常态化学习意识有待加强；二是实践能力有待提升，主动参与社会实践、服务群众的积极性不够；三是自我革新意识不足，存在安于现状、进取不足的问题，先锋模范作用发挥不够充分。</w:t>
+      </w:r>
+    </w:p>
+    <w:p>
+      <w:r>
+        <w:t>针对以上问题，我将从严整改、持续精进。筑牢思想根基，坚持常态化、系统化学习党的创新理论和时政热点，深刻把握新时代发展内涵，坚定理想信念</w:t>
+      </w:r>
+      <w:r>
+        <w:rPr>
+          <w:rFonts w:hint="eastAsia"/>
+        </w:rPr>
+        <w:t>。</w:t>
+      </w:r>
+      <w:r>
+        <w:t>强化实践担当，主动走出舒适区，积极参与志愿服务、基层实践和集体工作，在实干中提升能力、服务群众。今后我将初心不改、笃行不怠，持续锤炼党性，争取早日成为一名合格的共产党员。</w:t>
+      </w:r>
+    </w:p>
+    <w:p>
+      <w:r>
+        <w:t>请党组织继续对我监督、教育和考验。</w:t>
+      </w:r>
+    </w:p>
+    <w:p>
+      <w:pPr>
+        <w:rPr>
+          <w:rFonts w:hint="eastAsia"/>
+        </w:rPr>
+      </w:pPr>
+    </w:p>
     <w:sectPr>
       <w:pgSz w:w="11906" w:h="16838"/>
       <w:pgMar w:top="1440" w:right="1800" w:bottom="1440" w:left="1800" w:header="851" w:footer="992" w:gutter="0"/>
@@ -728,7 +971,6 @@
     <w:next w:val="a"/>
     <w:link w:val="20"/>
     <w:uiPriority w:val="9"/>
-    <w:semiHidden/>
     <w:unhideWhenUsed/>
     <w:qFormat/>
     <w:rsid w:val="00082314"/>
@@ -945,7 +1187,6 @@
     <w:basedOn w:val="a0"/>
     <w:link w:val="2"/>
     <w:uiPriority w:val="9"/>
-    <w:semiHidden/>
     <w:rsid w:val="00082314"/>
     <w:rPr>
       <w:rFonts w:asciiTheme="majorHAnsi" w:eastAsiaTheme="majorEastAsia" w:hAnsiTheme="majorHAnsi" w:cstheme="majorBidi"/>

</xml_diff>